<commit_message>
Drop logistic regression; add benchmarks slide and per-feature RF importance chart
The team cut the logistic-regression classifier for time. Remove it from the
pipeline: scripts/06_logistic.py, its results and figure, notebook section 8
(later sections renumbered), the report/slide builders and the docs.
Regression results are unaffected (logistic had its own CSV that nothing else
read), so no rerun is needed.

Presentation follow-ups that mirror the shared Canva deck:
- new slide 5 explaining the two benchmarks (persistence, training mean);
  script and work split renumbered to 13 slides, hand-over moved to slide 5
- slide 9 now uses a per-feature permutation-importance chart (top 10, plain
  labels); report/build/fig_rf_importance_slide.py regenerates it
</commit_message>
<xml_diff>
--- a/report/Group7_Final_Report_DRAFT.docx
+++ b/report/Group7_Final_Report_DRAFT.docx
@@ -47,7 +47,7 @@
           <w:color w:val="5A6070"/>
           <w:sz w:val="22"/>
         </w:rPr>
-        <w:t>Walk-forward evidence from 176 tokens and six machine-learning models</w:t>
+        <w:t>Walk-forward evidence from 176 tokens and five machine-learning models</w:t>
       </w:r>
     </w:p>
     <w:p>
@@ -140,7 +140,7 @@
           <w:i w:val="0"/>
           <w:sz w:val="22"/>
         </w:rPr>
-        <w:t>We ask whether a token's published unlock (emission) schedule adds forecasting power for its forward 14-day realized volatility beyond what trailing volatility and the market regime already explain. On a panel of 176 tokens over 2024-09 to 2026-08 (101,393 token-days) we run K-nearest neighbours, Random Forest, LightGBM, Ridge, Elastic Net and logistic regression twice, once on nine control features and once on controls plus 23 emission and static features, under a five-fold walk-forward protocol with embargo. Every regressor beats both the persistence forecast and the pooled-mean baseline (R</w:t>
+        <w:t>We ask whether a token's published unlock (emission) schedule adds forecasting power for its forward 14-day realized volatility beyond what trailing volatility and the market regime already explain. On a panel of 176 tokens over 2024-09 to 2026-08 (101,393 token-days) we run K-nearest neighbours, Random Forest, LightGBM, Ridge and Elastic Net twice, once on nine control features and once on controls plus 23 emission and static features, under a five-fold walk-forward protocol with embargo. Every regressor beats both the persistence forecast and the pooled-mean baseline (R</w:t>
       </w:r>
       <w:r>
         <w:rPr>
@@ -198,7 +198,7 @@
           <w:i w:val="0"/>
           <w:sz w:val="22"/>
         </w:rPr>
-        <w:t xml:space="preserve"> by +0.001 to +0.006 on average, against a fold-to-fold standard deviation of about 0.15, and the sign of the change flips between folds. Error analysis shows that the unlock features do not help even where unlocks are largest, and the classification view shows a small loss in ROC-AUC. We conclude that, in this panel, scheduled unlocks are not a reliable incremental volatility signal.</w:t>
+        <w:t xml:space="preserve"> by +0.001 to +0.006 on average, against a fold-to-fold standard deviation of about 0.15, and the sign of the change flips between folds. Error analysis shows that the unlock features do not help even where unlocks are largest. We conclude that, in this panel, scheduled unlocks are not a reliable incremental volatility signal.</w:t>
       </w:r>
     </w:p>
     <w:p>
@@ -433,7 +433,7 @@
           <w:i w:val="0"/>
           <w:sz w:val="22"/>
         </w:rPr>
-        <w:t xml:space="preserve"> Re-ask the question as classification (logistic regression), interpret what each model uses, and judge whether any improvement is useful in practice.</w:t>
+        <w:t xml:space="preserve"> Interpret what each model uses, and judge whether any improvement is useful in practice.</w:t>
       </w:r>
     </w:p>
     <w:p>
@@ -2328,84 +2328,6 @@
     </w:p>
     <w:p>
       <w:pPr>
-        <w:jc w:val="both"/>
-      </w:pPr>
-      <w:r>
-        <w:rPr>
-          <w:rFonts w:ascii="Calibri" w:hAnsi="Calibri"/>
-          <w:b/>
-          <w:i w:val="0"/>
-          <w:sz w:val="22"/>
-        </w:rPr>
-        <w:t xml:space="preserve">Logistic regression. </w:t>
-      </w:r>
-      <w:r>
-        <w:rPr>
-          <w:rFonts w:ascii="Calibri" w:hAnsi="Calibri"/>
-          <w:b w:val="0"/>
-          <w:i w:val="0"/>
-          <w:sz w:val="22"/>
-        </w:rPr>
-        <w:t>An L2-penalised classifier (C ∈ {10</w:t>
-      </w:r>
-      <w:r>
-        <w:rPr>
-          <w:rFonts w:ascii="Calibri" w:hAnsi="Calibri"/>
-          <w:b w:val="0"/>
-          <w:i w:val="0"/>
-          <w:sz w:val="22"/>
-          <w:vertAlign w:val="superscript"/>
-        </w:rPr>
-        <w:t>-5</w:t>
-      </w:r>
-      <w:r>
-        <w:rPr>
-          <w:rFonts w:ascii="Calibri" w:hAnsi="Calibri"/>
-          <w:b w:val="0"/>
-          <w:i w:val="0"/>
-          <w:sz w:val="22"/>
-        </w:rPr>
-        <w:t xml:space="preserve">, …, 10}, tuned by validation log loss) for two events defined from the forward target: </w:t>
-      </w:r>
-      <w:r>
-        <w:rPr>
-          <w:rFonts w:ascii="Calibri" w:hAnsi="Calibri"/>
-          <w:b/>
-          <w:i w:val="0"/>
-          <w:sz w:val="22"/>
-        </w:rPr>
-        <w:t>top20_xs</w:t>
-      </w:r>
-      <w:r>
-        <w:rPr>
-          <w:rFonts w:ascii="Calibri" w:hAnsi="Calibri"/>
-          <w:b w:val="0"/>
-          <w:i w:val="0"/>
-          <w:sz w:val="22"/>
-        </w:rPr>
-        <w:t xml:space="preserve">, the token is in the top 20% of forward volatility across all tokens on date D (base rate 20%), and </w:t>
-      </w:r>
-      <w:r>
-        <w:rPr>
-          <w:rFonts w:ascii="Calibri" w:hAnsi="Calibri"/>
-          <w:b/>
-          <w:i w:val="0"/>
-          <w:sz w:val="22"/>
-        </w:rPr>
-        <w:t>spike_1.5x</w:t>
-      </w:r>
-      <w:r>
-        <w:rPr>
-          <w:rFonts w:ascii="Calibri" w:hAnsi="Calibri"/>
-          <w:b w:val="0"/>
-          <w:i w:val="0"/>
-          <w:sz w:val="22"/>
-        </w:rPr>
-        <w:t>, forward volatility exceeds 1.5× the token's own trailing 30-day volatility (base rate 14%). We report ROC-AUC, PR-AUC and the Brier skill score against the training base rate; no resampling is used, since it would distort the probabilities.</w:t>
-      </w:r>
-    </w:p>
-    <w:p>
-      <w:pPr>
         <w:pStyle w:val="Heading1"/>
       </w:pPr>
       <w:r>
@@ -7831,7 +7753,7 @@
           <w:i w:val="0"/>
           <w:sz w:val="22"/>
         </w:rPr>
-        <w:t>Controls account for 92% of LightGBM's total split gain on the last fold, emission features for 4% and static features for 4%; the top three are ETH volatility, BTC volatility and trailing 30-day volatility, and the best emission feature (30-day unlocks as a share of total supply) has 1% (Figure A11).</w:t>
+        <w:t>Controls account for 92% of LightGBM's total split gain on the last fold, emission features for 4% and static features for 4%; the top three are ETH volatility, BTC volatility and trailing 30-day volatility, and the best emission feature (30-day unlocks as a share of total supply) has 1% (Figure A10).</w:t>
       </w:r>
     </w:p>
     <w:p>
@@ -7862,733 +7784,7 @@
         <w:pStyle w:val="Heading2"/>
       </w:pPr>
       <w:r>
-        <w:t>5.4  Classification view (logistic regression)</w:t>
-      </w:r>
-    </w:p>
-    <w:p>
-      <w:pPr>
-        <w:keepNext/>
-        <w:spacing w:after="40"/>
-        <w:jc w:val="left"/>
-      </w:pPr>
-      <w:r>
-        <w:rPr>
-          <w:rFonts w:ascii="Calibri" w:hAnsi="Calibri"/>
-          <w:b/>
-          <w:i w:val="0"/>
-          <w:color w:val="5A6070"/>
-          <w:sz w:val="18"/>
-        </w:rPr>
-        <w:t>Table 6. Logistic regression, daily panel, mean of 5 folds. Naive = rank by trailing 14d volatility; BSS = Brier skill score vs the training base rate.</w:t>
-      </w:r>
-    </w:p>
-    <w:tbl>
-      <w:tblPr>
-        <w:tblStyle w:val="TableGrid"/>
-        <w:tblW w:type="auto" w:w="0"/>
-        <w:jc w:val="center"/>
-        <w:tblLook w:firstColumn="1" w:firstRow="1" w:lastColumn="0" w:lastRow="0" w:noHBand="0" w:noVBand="1" w:val="04A0"/>
-      </w:tblPr>
-      <w:tblGrid>
-        <w:gridCol w:w="1071"/>
-        <w:gridCol w:w="1071"/>
-        <w:gridCol w:w="1071"/>
-        <w:gridCol w:w="1071"/>
-        <w:gridCol w:w="1071"/>
-        <w:gridCol w:w="1071"/>
-        <w:gridCol w:w="1071"/>
-        <w:gridCol w:w="1071"/>
-        <w:gridCol w:w="1071"/>
-      </w:tblGrid>
-      <w:tr>
-        <w:tc>
-          <w:tcPr>
-            <w:tcW w:type="dxa" w:w="2041"/>
-            <w:shd w:val="clear" w:color="auto" w:fill="1F2433"/>
-          </w:tcPr>
-          <w:p>
-            <w:pPr>
-              <w:keepNext/>
-              <w:spacing w:after="0" w:line="240" w:lineRule="auto"/>
-              <w:jc w:val="left"/>
-            </w:pPr>
-            <w:r>
-              <w:rPr>
-                <w:color w:val="FFFFFF"/>
-              </w:rPr>
-            </w:r>
-            <w:r>
-              <w:rPr>
-                <w:rFonts w:ascii="Calibri" w:hAnsi="Calibri"/>
-                <w:b/>
-                <w:i w:val="0"/>
-                <w:color w:val="FFFFFF"/>
-                <w:sz w:val="18"/>
-              </w:rPr>
-              <w:t>Event</w:t>
-            </w:r>
-          </w:p>
-        </w:tc>
-        <w:tc>
-          <w:tcPr>
-            <w:tcW w:type="dxa" w:w="907"/>
-            <w:shd w:val="clear" w:color="auto" w:fill="1F2433"/>
-          </w:tcPr>
-          <w:p>
-            <w:pPr>
-              <w:keepNext/>
-              <w:spacing w:after="0" w:line="240" w:lineRule="auto"/>
-              <w:jc w:val="center"/>
-            </w:pPr>
-            <w:r>
-              <w:rPr>
-                <w:color w:val="FFFFFF"/>
-              </w:rPr>
-            </w:r>
-            <w:r>
-              <w:rPr>
-                <w:rFonts w:ascii="Calibri" w:hAnsi="Calibri"/>
-                <w:b/>
-                <w:i w:val="0"/>
-                <w:color w:val="FFFFFF"/>
-                <w:sz w:val="18"/>
-              </w:rPr>
-              <w:t>AUC naive</w:t>
-            </w:r>
-          </w:p>
-        </w:tc>
-        <w:tc>
-          <w:tcPr>
-            <w:tcW w:type="dxa" w:w="907"/>
-            <w:shd w:val="clear" w:color="auto" w:fill="1F2433"/>
-          </w:tcPr>
-          <w:p>
-            <w:pPr>
-              <w:keepNext/>
-              <w:spacing w:after="0" w:line="240" w:lineRule="auto"/>
-              <w:jc w:val="center"/>
-            </w:pPr>
-            <w:r>
-              <w:rPr>
-                <w:color w:val="FFFFFF"/>
-              </w:rPr>
-            </w:r>
-            <w:r>
-              <w:rPr>
-                <w:rFonts w:ascii="Calibri" w:hAnsi="Calibri"/>
-                <w:b/>
-                <w:i w:val="0"/>
-                <w:color w:val="FFFFFF"/>
-                <w:sz w:val="18"/>
-              </w:rPr>
-              <w:t>AUC CTRL</w:t>
-            </w:r>
-          </w:p>
-        </w:tc>
-        <w:tc>
-          <w:tcPr>
-            <w:tcW w:type="dxa" w:w="907"/>
-            <w:shd w:val="clear" w:color="auto" w:fill="1F2433"/>
-          </w:tcPr>
-          <w:p>
-            <w:pPr>
-              <w:keepNext/>
-              <w:spacing w:after="0" w:line="240" w:lineRule="auto"/>
-              <w:jc w:val="center"/>
-            </w:pPr>
-            <w:r>
-              <w:rPr>
-                <w:color w:val="FFFFFF"/>
-              </w:rPr>
-            </w:r>
-            <w:r>
-              <w:rPr>
-                <w:rFonts w:ascii="Calibri" w:hAnsi="Calibri"/>
-                <w:b/>
-                <w:i w:val="0"/>
-                <w:color w:val="FFFFFF"/>
-                <w:sz w:val="18"/>
-              </w:rPr>
-              <w:t>AUC FULL</w:t>
-            </w:r>
-          </w:p>
-        </w:tc>
-        <w:tc>
-          <w:tcPr>
-            <w:tcW w:type="dxa" w:w="794"/>
-            <w:shd w:val="clear" w:color="auto" w:fill="1F2433"/>
-          </w:tcPr>
-          <w:p>
-            <w:pPr>
-              <w:keepNext/>
-              <w:spacing w:after="0" w:line="240" w:lineRule="auto"/>
-              <w:jc w:val="center"/>
-            </w:pPr>
-            <w:r>
-              <w:rPr>
-                <w:color w:val="FFFFFF"/>
-              </w:rPr>
-            </w:r>
-            <w:r>
-              <w:rPr>
-                <w:rFonts w:ascii="Calibri" w:hAnsi="Calibri"/>
-                <w:b/>
-                <w:i w:val="0"/>
-                <w:color w:val="FFFFFF"/>
-                <w:sz w:val="18"/>
-              </w:rPr>
-              <w:t>ΔAUC</w:t>
-            </w:r>
-          </w:p>
-        </w:tc>
-        <w:tc>
-          <w:tcPr>
-            <w:tcW w:type="dxa" w:w="1020"/>
-            <w:shd w:val="clear" w:color="auto" w:fill="1F2433"/>
-          </w:tcPr>
-          <w:p>
-            <w:pPr>
-              <w:keepNext/>
-              <w:spacing w:after="0" w:line="240" w:lineRule="auto"/>
-              <w:jc w:val="center"/>
-            </w:pPr>
-            <w:r>
-              <w:rPr>
-                <w:color w:val="FFFFFF"/>
-              </w:rPr>
-            </w:r>
-            <w:r>
-              <w:rPr>
-                <w:rFonts w:ascii="Calibri" w:hAnsi="Calibri"/>
-                <w:b/>
-                <w:i w:val="0"/>
-                <w:color w:val="FFFFFF"/>
-                <w:sz w:val="18"/>
-              </w:rPr>
-              <w:t>PR-AUC CTRL</w:t>
-            </w:r>
-          </w:p>
-        </w:tc>
-        <w:tc>
-          <w:tcPr>
-            <w:tcW w:type="dxa" w:w="1020"/>
-            <w:shd w:val="clear" w:color="auto" w:fill="1F2433"/>
-          </w:tcPr>
-          <w:p>
-            <w:pPr>
-              <w:keepNext/>
-              <w:spacing w:after="0" w:line="240" w:lineRule="auto"/>
-              <w:jc w:val="center"/>
-            </w:pPr>
-            <w:r>
-              <w:rPr>
-                <w:color w:val="FFFFFF"/>
-              </w:rPr>
-            </w:r>
-            <w:r>
-              <w:rPr>
-                <w:rFonts w:ascii="Calibri" w:hAnsi="Calibri"/>
-                <w:b/>
-                <w:i w:val="0"/>
-                <w:color w:val="FFFFFF"/>
-                <w:sz w:val="18"/>
-              </w:rPr>
-              <w:t>PR-AUC FULL</w:t>
-            </w:r>
-          </w:p>
-        </w:tc>
-        <w:tc>
-          <w:tcPr>
-            <w:tcW w:type="dxa" w:w="850"/>
-            <w:shd w:val="clear" w:color="auto" w:fill="1F2433"/>
-          </w:tcPr>
-          <w:p>
-            <w:pPr>
-              <w:keepNext/>
-              <w:spacing w:after="0" w:line="240" w:lineRule="auto"/>
-              <w:jc w:val="center"/>
-            </w:pPr>
-            <w:r>
-              <w:rPr>
-                <w:color w:val="FFFFFF"/>
-              </w:rPr>
-            </w:r>
-            <w:r>
-              <w:rPr>
-                <w:rFonts w:ascii="Calibri" w:hAnsi="Calibri"/>
-                <w:b/>
-                <w:i w:val="0"/>
-                <w:color w:val="FFFFFF"/>
-                <w:sz w:val="18"/>
-              </w:rPr>
-              <w:t>BSS CTRL</w:t>
-            </w:r>
-          </w:p>
-        </w:tc>
-        <w:tc>
-          <w:tcPr>
-            <w:tcW w:type="dxa" w:w="850"/>
-            <w:shd w:val="clear" w:color="auto" w:fill="1F2433"/>
-          </w:tcPr>
-          <w:p>
-            <w:pPr>
-              <w:keepNext/>
-              <w:spacing w:after="0" w:line="240" w:lineRule="auto"/>
-              <w:jc w:val="center"/>
-            </w:pPr>
-            <w:r>
-              <w:rPr>
-                <w:color w:val="FFFFFF"/>
-              </w:rPr>
-            </w:r>
-            <w:r>
-              <w:rPr>
-                <w:rFonts w:ascii="Calibri" w:hAnsi="Calibri"/>
-                <w:b/>
-                <w:i w:val="0"/>
-                <w:color w:val="FFFFFF"/>
-                <w:sz w:val="18"/>
-              </w:rPr>
-              <w:t>BSS FULL</w:t>
-            </w:r>
-          </w:p>
-        </w:tc>
-      </w:tr>
-      <w:tr>
-        <w:tc>
-          <w:tcPr>
-            <w:tcW w:type="dxa" w:w="2041"/>
-          </w:tcPr>
-          <w:p>
-            <w:pPr>
-              <w:keepNext/>
-              <w:spacing w:after="0" w:line="240" w:lineRule="auto"/>
-              <w:jc w:val="left"/>
-            </w:pPr>
-            <w:r/>
-            <w:r>
-              <w:rPr>
-                <w:rFonts w:ascii="Calibri" w:hAnsi="Calibri"/>
-                <w:b w:val="0"/>
-                <w:i w:val="0"/>
-                <w:sz w:val="18"/>
-              </w:rPr>
-              <w:t>Top 20% cross-section</w:t>
-            </w:r>
-          </w:p>
-        </w:tc>
-        <w:tc>
-          <w:tcPr>
-            <w:tcW w:type="dxa" w:w="907"/>
-          </w:tcPr>
-          <w:p>
-            <w:pPr>
-              <w:keepNext/>
-              <w:spacing w:after="0" w:line="240" w:lineRule="auto"/>
-              <w:jc w:val="center"/>
-            </w:pPr>
-            <w:r/>
-            <w:r>
-              <w:rPr>
-                <w:rFonts w:ascii="Calibri" w:hAnsi="Calibri"/>
-                <w:b w:val="0"/>
-                <w:i w:val="0"/>
-                <w:sz w:val="18"/>
-              </w:rPr>
-              <w:t>0.653</w:t>
-            </w:r>
-          </w:p>
-        </w:tc>
-        <w:tc>
-          <w:tcPr>
-            <w:tcW w:type="dxa" w:w="907"/>
-          </w:tcPr>
-          <w:p>
-            <w:pPr>
-              <w:keepNext/>
-              <w:spacing w:after="0" w:line="240" w:lineRule="auto"/>
-              <w:jc w:val="center"/>
-            </w:pPr>
-            <w:r/>
-            <w:r>
-              <w:rPr>
-                <w:rFonts w:ascii="Calibri" w:hAnsi="Calibri"/>
-                <w:b w:val="0"/>
-                <w:i w:val="0"/>
-                <w:sz w:val="18"/>
-              </w:rPr>
-              <w:t>0.694</w:t>
-            </w:r>
-          </w:p>
-        </w:tc>
-        <w:tc>
-          <w:tcPr>
-            <w:tcW w:type="dxa" w:w="907"/>
-          </w:tcPr>
-          <w:p>
-            <w:pPr>
-              <w:keepNext/>
-              <w:spacing w:after="0" w:line="240" w:lineRule="auto"/>
-              <w:jc w:val="center"/>
-            </w:pPr>
-            <w:r/>
-            <w:r>
-              <w:rPr>
-                <w:rFonts w:ascii="Calibri" w:hAnsi="Calibri"/>
-                <w:b w:val="0"/>
-                <w:i w:val="0"/>
-                <w:sz w:val="18"/>
-              </w:rPr>
-              <w:t>0.693</w:t>
-            </w:r>
-          </w:p>
-        </w:tc>
-        <w:tc>
-          <w:tcPr>
-            <w:tcW w:type="dxa" w:w="794"/>
-          </w:tcPr>
-          <w:p>
-            <w:pPr>
-              <w:keepNext/>
-              <w:spacing w:after="0" w:line="240" w:lineRule="auto"/>
-              <w:jc w:val="center"/>
-            </w:pPr>
-            <w:r/>
-            <w:r>
-              <w:rPr>
-                <w:rFonts w:ascii="Calibri" w:hAnsi="Calibri"/>
-                <w:b w:val="0"/>
-                <w:i w:val="0"/>
-                <w:sz w:val="18"/>
-              </w:rPr>
-              <w:t>-0.002</w:t>
-            </w:r>
-          </w:p>
-        </w:tc>
-        <w:tc>
-          <w:tcPr>
-            <w:tcW w:type="dxa" w:w="1020"/>
-          </w:tcPr>
-          <w:p>
-            <w:pPr>
-              <w:keepNext/>
-              <w:spacing w:after="0" w:line="240" w:lineRule="auto"/>
-              <w:jc w:val="center"/>
-            </w:pPr>
-            <w:r/>
-            <w:r>
-              <w:rPr>
-                <w:rFonts w:ascii="Calibri" w:hAnsi="Calibri"/>
-                <w:b w:val="0"/>
-                <w:i w:val="0"/>
-                <w:sz w:val="18"/>
-              </w:rPr>
-              <w:t>0.384</w:t>
-            </w:r>
-          </w:p>
-        </w:tc>
-        <w:tc>
-          <w:tcPr>
-            <w:tcW w:type="dxa" w:w="1020"/>
-          </w:tcPr>
-          <w:p>
-            <w:pPr>
-              <w:keepNext/>
-              <w:spacing w:after="0" w:line="240" w:lineRule="auto"/>
-              <w:jc w:val="center"/>
-            </w:pPr>
-            <w:r/>
-            <w:r>
-              <w:rPr>
-                <w:rFonts w:ascii="Calibri" w:hAnsi="Calibri"/>
-                <w:b w:val="0"/>
-                <w:i w:val="0"/>
-                <w:sz w:val="18"/>
-              </w:rPr>
-              <w:t>0.373</w:t>
-            </w:r>
-          </w:p>
-        </w:tc>
-        <w:tc>
-          <w:tcPr>
-            <w:tcW w:type="dxa" w:w="850"/>
-          </w:tcPr>
-          <w:p>
-            <w:pPr>
-              <w:keepNext/>
-              <w:spacing w:after="0" w:line="240" w:lineRule="auto"/>
-              <w:jc w:val="center"/>
-            </w:pPr>
-            <w:r/>
-            <w:r>
-              <w:rPr>
-                <w:rFonts w:ascii="Calibri" w:hAnsi="Calibri"/>
-                <w:b w:val="0"/>
-                <w:i w:val="0"/>
-                <w:sz w:val="18"/>
-              </w:rPr>
-              <w:t>0.079</w:t>
-            </w:r>
-          </w:p>
-        </w:tc>
-        <w:tc>
-          <w:tcPr>
-            <w:tcW w:type="dxa" w:w="850"/>
-          </w:tcPr>
-          <w:p>
-            <w:pPr>
-              <w:keepNext/>
-              <w:spacing w:after="0" w:line="240" w:lineRule="auto"/>
-              <w:jc w:val="center"/>
-            </w:pPr>
-            <w:r/>
-            <w:r>
-              <w:rPr>
-                <w:rFonts w:ascii="Calibri" w:hAnsi="Calibri"/>
-                <w:b w:val="0"/>
-                <w:i w:val="0"/>
-                <w:sz w:val="18"/>
-              </w:rPr>
-              <w:t>0.072</w:t>
-            </w:r>
-          </w:p>
-        </w:tc>
-      </w:tr>
-      <w:tr>
-        <w:tc>
-          <w:tcPr>
-            <w:tcW w:type="dxa" w:w="2041"/>
-            <w:shd w:val="clear" w:color="auto" w:fill="F1F3F6"/>
-          </w:tcPr>
-          <w:p>
-            <w:pPr>
-              <w:keepNext w:val="0"/>
-              <w:spacing w:after="0" w:line="240" w:lineRule="auto"/>
-              <w:jc w:val="left"/>
-            </w:pPr>
-            <w:r/>
-            <w:r>
-              <w:rPr>
-                <w:rFonts w:ascii="Calibri" w:hAnsi="Calibri"/>
-                <w:b w:val="0"/>
-                <w:i w:val="0"/>
-                <w:sz w:val="18"/>
-              </w:rPr>
-              <w:t>Spike &gt; 1.5× own 30d vol</w:t>
-            </w:r>
-          </w:p>
-        </w:tc>
-        <w:tc>
-          <w:tcPr>
-            <w:tcW w:type="dxa" w:w="907"/>
-            <w:shd w:val="clear" w:color="auto" w:fill="F1F3F6"/>
-          </w:tcPr>
-          <w:p>
-            <w:pPr>
-              <w:keepNext w:val="0"/>
-              <w:spacing w:after="0" w:line="240" w:lineRule="auto"/>
-              <w:jc w:val="center"/>
-            </w:pPr>
-            <w:r/>
-            <w:r>
-              <w:rPr>
-                <w:rFonts w:ascii="Calibri" w:hAnsi="Calibri"/>
-                <w:b w:val="0"/>
-                <w:i w:val="0"/>
-                <w:sz w:val="18"/>
-              </w:rPr>
-              <w:t>–</w:t>
-            </w:r>
-          </w:p>
-        </w:tc>
-        <w:tc>
-          <w:tcPr>
-            <w:tcW w:type="dxa" w:w="907"/>
-            <w:shd w:val="clear" w:color="auto" w:fill="F1F3F6"/>
-          </w:tcPr>
-          <w:p>
-            <w:pPr>
-              <w:keepNext w:val="0"/>
-              <w:spacing w:after="0" w:line="240" w:lineRule="auto"/>
-              <w:jc w:val="center"/>
-            </w:pPr>
-            <w:r/>
-            <w:r>
-              <w:rPr>
-                <w:rFonts w:ascii="Calibri" w:hAnsi="Calibri"/>
-                <w:b w:val="0"/>
-                <w:i w:val="0"/>
-                <w:sz w:val="18"/>
-              </w:rPr>
-              <w:t>0.722</w:t>
-            </w:r>
-          </w:p>
-        </w:tc>
-        <w:tc>
-          <w:tcPr>
-            <w:tcW w:type="dxa" w:w="907"/>
-            <w:shd w:val="clear" w:color="auto" w:fill="F1F3F6"/>
-          </w:tcPr>
-          <w:p>
-            <w:pPr>
-              <w:keepNext w:val="0"/>
-              <w:spacing w:after="0" w:line="240" w:lineRule="auto"/>
-              <w:jc w:val="center"/>
-            </w:pPr>
-            <w:r/>
-            <w:r>
-              <w:rPr>
-                <w:rFonts w:ascii="Calibri" w:hAnsi="Calibri"/>
-                <w:b w:val="0"/>
-                <w:i w:val="0"/>
-                <w:sz w:val="18"/>
-              </w:rPr>
-              <w:t>0.718</w:t>
-            </w:r>
-          </w:p>
-        </w:tc>
-        <w:tc>
-          <w:tcPr>
-            <w:tcW w:type="dxa" w:w="794"/>
-            <w:shd w:val="clear" w:color="auto" w:fill="F1F3F6"/>
-          </w:tcPr>
-          <w:p>
-            <w:pPr>
-              <w:keepNext w:val="0"/>
-              <w:spacing w:after="0" w:line="240" w:lineRule="auto"/>
-              <w:jc w:val="center"/>
-            </w:pPr>
-            <w:r/>
-            <w:r>
-              <w:rPr>
-                <w:rFonts w:ascii="Calibri" w:hAnsi="Calibri"/>
-                <w:b w:val="0"/>
-                <w:i w:val="0"/>
-                <w:sz w:val="18"/>
-              </w:rPr>
-              <w:t>-0.004</w:t>
-            </w:r>
-          </w:p>
-        </w:tc>
-        <w:tc>
-          <w:tcPr>
-            <w:tcW w:type="dxa" w:w="1020"/>
-            <w:shd w:val="clear" w:color="auto" w:fill="F1F3F6"/>
-          </w:tcPr>
-          <w:p>
-            <w:pPr>
-              <w:keepNext w:val="0"/>
-              <w:spacing w:after="0" w:line="240" w:lineRule="auto"/>
-              <w:jc w:val="center"/>
-            </w:pPr>
-            <w:r/>
-            <w:r>
-              <w:rPr>
-                <w:rFonts w:ascii="Calibri" w:hAnsi="Calibri"/>
-                <w:b w:val="0"/>
-                <w:i w:val="0"/>
-                <w:sz w:val="18"/>
-              </w:rPr>
-              <w:t>0.283</w:t>
-            </w:r>
-          </w:p>
-        </w:tc>
-        <w:tc>
-          <w:tcPr>
-            <w:tcW w:type="dxa" w:w="1020"/>
-            <w:shd w:val="clear" w:color="auto" w:fill="F1F3F6"/>
-          </w:tcPr>
-          <w:p>
-            <w:pPr>
-              <w:keepNext w:val="0"/>
-              <w:spacing w:after="0" w:line="240" w:lineRule="auto"/>
-              <w:jc w:val="center"/>
-            </w:pPr>
-            <w:r/>
-            <w:r>
-              <w:rPr>
-                <w:rFonts w:ascii="Calibri" w:hAnsi="Calibri"/>
-                <w:b w:val="0"/>
-                <w:i w:val="0"/>
-                <w:sz w:val="18"/>
-              </w:rPr>
-              <w:t>0.279</w:t>
-            </w:r>
-          </w:p>
-        </w:tc>
-        <w:tc>
-          <w:tcPr>
-            <w:tcW w:type="dxa" w:w="850"/>
-            <w:shd w:val="clear" w:color="auto" w:fill="F1F3F6"/>
-          </w:tcPr>
-          <w:p>
-            <w:pPr>
-              <w:keepNext w:val="0"/>
-              <w:spacing w:after="0" w:line="240" w:lineRule="auto"/>
-              <w:jc w:val="center"/>
-            </w:pPr>
-            <w:r/>
-            <w:r>
-              <w:rPr>
-                <w:rFonts w:ascii="Calibri" w:hAnsi="Calibri"/>
-                <w:b w:val="0"/>
-                <w:i w:val="0"/>
-                <w:sz w:val="18"/>
-              </w:rPr>
-              <w:t>0.043</w:t>
-            </w:r>
-          </w:p>
-        </w:tc>
-        <w:tc>
-          <w:tcPr>
-            <w:tcW w:type="dxa" w:w="850"/>
-            <w:shd w:val="clear" w:color="auto" w:fill="F1F3F6"/>
-          </w:tcPr>
-          <w:p>
-            <w:pPr>
-              <w:keepNext w:val="0"/>
-              <w:spacing w:after="0" w:line="240" w:lineRule="auto"/>
-              <w:jc w:val="center"/>
-            </w:pPr>
-            <w:r/>
-            <w:r>
-              <w:rPr>
-                <w:rFonts w:ascii="Calibri" w:hAnsi="Calibri"/>
-                <w:b w:val="0"/>
-                <w:i w:val="0"/>
-                <w:sz w:val="18"/>
-              </w:rPr>
-              <w:t>0.041</w:t>
-            </w:r>
-          </w:p>
-        </w:tc>
-      </w:tr>
-    </w:tbl>
-    <w:p>
-      <w:pPr>
-        <w:spacing w:after="0"/>
-      </w:pPr>
-    </w:p>
-    <w:p>
-      <w:pPr>
-        <w:jc w:val="both"/>
-      </w:pPr>
-      <w:r>
-        <w:rPr>
-          <w:rFonts w:ascii="Calibri" w:hAnsi="Calibri"/>
-          <w:b w:val="0"/>
-          <w:i w:val="0"/>
-          <w:sz w:val="22"/>
-        </w:rPr>
-        <w:t>On controls, logistic regression identifies high-volatility tokens clearly better than ranking by trailing volatility (AUC 0.694 vs 0.653). Its coefficients rank token age (younger tokens are more often in the top 20%) and trailing volatility first; the 90-day unlock share enters with an odds ratio of about 1.1 per s.d., yet adding the unlock features lowers ROC-AUC, PR-AUC and Brier skill for both events on both panels (Figure A8).</w:t>
-      </w:r>
-    </w:p>
-    <w:p>
-      <w:pPr>
-        <w:pStyle w:val="Heading2"/>
-      </w:pPr>
-      <w:r>
-        <w:t>5.5  Robustness</w:t>
+        <w:t>5.4  Robustness</w:t>
       </w:r>
     </w:p>
     <w:p>
@@ -8693,7 +7889,7 @@
         <w:pStyle w:val="Heading2"/>
       </w:pPr>
       <w:r>
-        <w:t>5.6  Model comparison and practical relevance</w:t>
+        <w:t>5.5  Model comparison and practical relevance</w:t>
       </w:r>
     </w:p>
     <w:p>
@@ -8788,7 +7984,7 @@
           <w:i w:val="0"/>
           <w:sz w:val="22"/>
         </w:rPr>
-        <w:t>Once trailing volatility and the market regime are controlled for, scheduled token unlocks do not add reliable forecasting power for 14-day forward realized volatility in this panel. Six models agree, the average gain is tiny relative to fold-to-fold variation, its sign is unstable, the unlock features hurt where unlocks are largest, and the classification view shows a small loss. Settings were chosen on validation data and the test results were reported without changing the models in response.</w:t>
+        <w:t>Once trailing volatility and the market regime are controlled for, scheduled token unlocks do not add reliable forecasting power for 14-day forward realized volatility in this panel. Five models agree, the average gain is tiny relative to fold-to-fold variation, its sign is unstable, and the unlock features hurt where unlocks are largest. Settings were chosen on validation data and the test results were reported without changing the models in response.</w:t>
       </w:r>
     </w:p>
     <w:p>
@@ -14706,7 +13902,7 @@
                 <w:color w:val="C0392B"/>
                 <w:sz w:val="18"/>
               </w:rPr>
-              <w:t>[e.g. Logistic]</w:t>
+              <w:t>[e.g. LightGBM]</w:t>
             </w:r>
           </w:p>
         </w:tc>
@@ -15240,65 +14436,8 @@
       <w:r>
         <w:drawing>
           <wp:inline xmlns:a="http://schemas.openxmlformats.org/drawingml/2006/main" xmlns:pic="http://schemas.openxmlformats.org/drawingml/2006/picture">
-            <wp:extent cx="5400000" cy="2460034"/>
+            <wp:extent cx="4320000" cy="2651330"/>
             <wp:docPr id="10" name="Picture 10"/>
-            <wp:cNvGraphicFramePr>
-              <a:graphicFrameLocks noChangeAspect="1"/>
-            </wp:cNvGraphicFramePr>
-            <a:graphic>
-              <a:graphicData uri="http://schemas.openxmlformats.org/drawingml/2006/picture">
-                <pic:pic>
-                  <pic:nvPicPr>
-                    <pic:cNvPr id="0" name="logistic_auc.png"/>
-                    <pic:cNvPicPr/>
-                  </pic:nvPicPr>
-                  <pic:blipFill>
-                    <a:blip r:embed="rId19"/>
-                    <a:stretch>
-                      <a:fillRect/>
-                    </a:stretch>
-                  </pic:blipFill>
-                  <pic:spPr>
-                    <a:xfrm>
-                      <a:off x="0" y="0"/>
-                      <a:ext cx="5400000" cy="2460034"/>
-                    </a:xfrm>
-                    <a:prstGeom prst="rect"/>
-                  </pic:spPr>
-                </pic:pic>
-              </a:graphicData>
-            </a:graphic>
-          </wp:inline>
-        </w:drawing>
-      </w:r>
-    </w:p>
-    <w:p>
-      <w:pPr>
-        <w:spacing w:after="120"/>
-        <w:jc w:val="center"/>
-      </w:pPr>
-      <w:r>
-        <w:rPr>
-          <w:rFonts w:ascii="Calibri" w:hAnsi="Calibri"/>
-          <w:b w:val="0"/>
-          <w:i w:val="0"/>
-          <w:color w:val="5A6070"/>
-          <w:sz w:val="18"/>
-        </w:rPr>
-        <w:t>Figure A8. Logistic regression test ROC-AUC, controls vs FULL; dashed = rank by trailing 14d volatility.</w:t>
-      </w:r>
-    </w:p>
-    <w:p>
-      <w:pPr>
-        <w:keepNext/>
-        <w:spacing w:after="0"/>
-        <w:jc w:val="center"/>
-      </w:pPr>
-      <w:r>
-        <w:drawing>
-          <wp:inline xmlns:a="http://schemas.openxmlformats.org/drawingml/2006/main" xmlns:pic="http://schemas.openxmlformats.org/drawingml/2006/picture">
-            <wp:extent cx="4320000" cy="2651330"/>
-            <wp:docPr id="11" name="Picture 11"/>
             <wp:cNvGraphicFramePr>
               <a:graphicFrameLocks noChangeAspect="1"/>
             </wp:cNvGraphicFramePr>
@@ -15310,7 +14449,7 @@
                     <pic:cNvPicPr/>
                   </pic:nvPicPr>
                   <pic:blipFill>
-                    <a:blip r:embed="rId20"/>
+                    <a:blip r:embed="rId19"/>
                     <a:stretch>
                       <a:fillRect/>
                     </a:stretch>
@@ -15342,7 +14481,7 @@
           <w:color w:val="5A6070"/>
           <w:sz w:val="18"/>
         </w:rPr>
-        <w:t>Figure A9. KNN validation RMSE against k (mean over folds), by feature set.</w:t>
+        <w:t>Figure A8. KNN validation RMSE against k (mean over folds), by feature set.</w:t>
       </w:r>
     </w:p>
     <w:p>
@@ -15355,7 +14494,7 @@
         <w:drawing>
           <wp:inline xmlns:a="http://schemas.openxmlformats.org/drawingml/2006/main" xmlns:pic="http://schemas.openxmlformats.org/drawingml/2006/picture">
             <wp:extent cx="4680000" cy="4216727"/>
-            <wp:docPr id="12" name="Picture 12"/>
+            <wp:docPr id="11" name="Picture 11"/>
             <wp:cNvGraphicFramePr>
               <a:graphicFrameLocks noChangeAspect="1"/>
             </wp:cNvGraphicFramePr>
@@ -15367,7 +14506,7 @@
                     <pic:cNvPicPr/>
                   </pic:nvPicPr>
                   <pic:blipFill>
-                    <a:blip r:embed="rId21"/>
+                    <a:blip r:embed="rId20"/>
                     <a:stretch>
                       <a:fillRect/>
                     </a:stretch>
@@ -15399,7 +14538,7 @@
           <w:color w:val="5A6070"/>
           <w:sz w:val="18"/>
         </w:rPr>
-        <w:t>Figure A10. Spearman correlations between target, controls and emission features.</w:t>
+        <w:t>Figure A9. Spearman correlations between target, controls and emission features.</w:t>
       </w:r>
     </w:p>
     <w:p>
@@ -15412,7 +14551,7 @@
         <w:drawing>
           <wp:inline xmlns:a="http://schemas.openxmlformats.org/drawingml/2006/main" xmlns:pic="http://schemas.openxmlformats.org/drawingml/2006/picture">
             <wp:extent cx="4680000" cy="3036488"/>
-            <wp:docPr id="13" name="Picture 13"/>
+            <wp:docPr id="12" name="Picture 12"/>
             <wp:cNvGraphicFramePr>
               <a:graphicFrameLocks noChangeAspect="1"/>
             </wp:cNvGraphicFramePr>
@@ -15424,7 +14563,7 @@
                     <pic:cNvPicPr/>
                   </pic:nvPicPr>
                   <pic:blipFill>
-                    <a:blip r:embed="rId22"/>
+                    <a:blip r:embed="rId21"/>
                     <a:stretch>
                       <a:fillRect/>
                     </a:stretch>
@@ -15456,7 +14595,7 @@
           <w:color w:val="5A6070"/>
           <w:sz w:val="18"/>
         </w:rPr>
-        <w:t>Figure A11. LightGBM (FULL, last fold): share of total split gain by feature, coloured by feature group.</w:t>
+        <w:t>Figure A10. LightGBM (FULL, last fold): share of total split gain by feature, coloured by feature group.</w:t>
       </w:r>
     </w:p>
     <w:p>

</xml_diff>